<commit_message>
Update paper title and abstract for clarity; add new version of the document and remove temporary files.
</commit_message>
<xml_diff>
--- a/paper/paper_v2.docx
+++ b/paper/paper_v2.docx
@@ -3,8 +3,22 @@
 <w:document xmlns:wpc="http://schemas.microsoft.com/office/word/2010/wordprocessingCanvas" xmlns:cx="http://schemas.microsoft.com/office/drawing/2014/chartex" xmlns:cx1="http://schemas.microsoft.com/office/drawing/2015/9/8/chartex" xmlns:cx2="http://schemas.microsoft.com/office/drawing/2015/10/21/chartex" xmlns:cx3="http://schemas.microsoft.com/office/drawing/2016/5/9/chartex" xmlns:cx4="http://schemas.microsoft.com/office/drawing/2016/5/10/chartex" xmlns:cx5="http://schemas.microsoft.com/office/drawing/2016/5/11/chartex" xmlns:cx6="http://schemas.microsoft.com/office/drawing/2016/5/12/chartex" xmlns:cx7="http://schemas.microsoft.com/office/drawing/2016/5/13/chartex" xmlns:cx8="http://schemas.microsoft.com/office/drawing/2016/5/14/chartex" xmlns:mc="http://schemas.openxmlformats.org/markup-compatibility/2006" xmlns:aink="http://schemas.microsoft.com/office/drawing/2016/ink" xmlns:am3d="http://schemas.microsoft.com/office/drawing/2017/model3d" xmlns:o="urn:schemas-microsoft-com:office:office" xmlns:oel="http://schemas.microsoft.com/office/2019/extlst" xmlns:r="http://schemas.openxmlformats.org/officeDocument/2006/relationships" xmlns:m="http://schemas.openxmlformats.org/officeDocument/2006/math" xmlns:v="urn:schemas-microsoft-com:vml" xmlns:wp14="http://schemas.microsoft.com/office/word/2010/wordprocessingDrawing" xmlns:wp="http://schemas.openxmlformats.org/drawingml/2006/wordprocessingDrawing" xmlns:w10="urn:schemas-microsoft-com:office:word" xmlns:w="http://schemas.openxmlformats.org/wordprocessingml/2006/main" xmlns:w14="http://schemas.microsoft.com/office/word/2010/wordml" xmlns:w15="http://schemas.microsoft.com/office/word/2012/wordml" xmlns:w16cex="http://schemas.microsoft.com/office/word/2018/wordml/cex" xmlns:w16cid="http://schemas.microsoft.com/office/word/2016/wordml/cid" xmlns:w16="http://schemas.microsoft.com/office/word/2018/wordml" xmlns:w16du="http://schemas.microsoft.com/office/word/2023/wordml/word16du" xmlns:w16sdtdh="http://schemas.microsoft.com/office/word/2020/wordml/sdtdatahash" xmlns:w16sdtfl="http://schemas.microsoft.com/office/word/2024/wordml/sdtformatlock" xmlns:w16se="http://schemas.microsoft.com/office/word/2015/wordml/symex" xmlns:wpg="http://schemas.microsoft.com/office/word/2010/wordprocessingGroup" xmlns:wpi="http://schemas.microsoft.com/office/word/2010/wordprocessingInk" xmlns:wne="http://schemas.microsoft.com/office/word/2006/wordml" xmlns:wps="http://schemas.microsoft.com/office/word/2010/wordprocessingShape" mc:Ignorable="w14 w15 w16se w16cid w16 w16cex w16sdtdh w16sdtfl w16du wp14">
   <w:body>
     <w:p>
-      <w:r>
-        <w:t>When Coding Agents Repeat: Persistence, Reinforcement, and the Limits of Loop Breaking</w:t>
+      <w:pPr>
+        <w:rPr>
+          <w:rFonts w:hint="eastAsia"/>
+        </w:rPr>
+      </w:pPr>
+      <w:r>
+        <w:t>When Coding Agents Repeat: Persistence</w:t>
+      </w:r>
+      <w:r>
+        <w:rPr>
+          <w:rFonts w:hint="eastAsia"/>
+        </w:rPr>
+        <w:t>, selection,</w:t>
+      </w:r>
+      <w:r>
+        <w:t xml:space="preserve"> and the Limits of Loop Breaking</w:t>
       </w:r>
       <w:r>
         <w:rPr>
@@ -23,7 +37,19 @@
         <w:rPr>
           <w:rFonts w:hint="eastAsia"/>
         </w:rPr>
-        <w:t>Why Gemma 4's coding agent repeats tool calls, and why breaking the loop does not fix the task</w:t>
+        <w:t>The study of Gemmat 4</w:t>
+      </w:r>
+      <w:r>
+        <w:t>’</w:t>
+      </w:r>
+      <w:r>
+        <w:rPr>
+          <w:rFonts w:hint="eastAsia"/>
+        </w:rPr>
+        <w:t xml:space="preserve">s coding agent repeating </w:t>
+      </w:r>
+      <w:r>
+        <w:t>behaviors</w:t>
       </w:r>
     </w:p>
     <w:p>
@@ -63,6 +89,11 @@
       </w:r>
     </w:p>
     <w:p>
+      <w:pPr>
+        <w:rPr>
+          <w:rFonts w:hint="eastAsia"/>
+        </w:rPr>
+      </w:pPr>
       <w:r>
         <w:rPr>
           <w:rFonts w:hint="eastAsia"/>
@@ -73,6 +104,9 @@
     <w:p>
       <w:pPr>
         <w:spacing w:before="240"/>
+        <w:rPr>
+          <w:rFonts w:hint="eastAsia"/>
+        </w:rPr>
       </w:pPr>
       <w:r>
         <w:rPr>
@@ -83,6 +117,11 @@
       </w:r>
     </w:p>
     <w:p>
+      <w:pPr>
+        <w:rPr>
+          <w:rFonts w:hint="eastAsia"/>
+        </w:rPr>
+      </w:pPr>
       <w:r>
         <w:rPr>
           <w:rFonts w:hint="eastAsia"/>
@@ -91,14 +130,45 @@
       </w:r>
     </w:p>
     <w:p>
-      <w:r>
-        <w:rPr>
-          <w:rFonts w:hint="eastAsia"/>
-        </w:rPr>
-        <w:t>We met this failure while building an agent with Gemma 4 31B, thinking off, for Kaggle's Gemma 4 Developer Agent competition. Our first plan was on-policy self-distillation from the same model with thinking on. A check before training showed that the teacher shares the loop: given the agent's history at its third or later identical call, the thinking-on model repeated an earlier call 83% of the time. We turned to the loops themselves.</w:t>
-      </w:r>
-    </w:p>
-    <w:p>
+      <w:pPr>
+        <w:rPr>
+          <w:rFonts w:hint="eastAsia"/>
+          <w:color w:val="EE0000"/>
+        </w:rPr>
+      </w:pPr>
+      <w:r>
+        <w:rPr>
+          <w:rFonts w:hint="eastAsia"/>
+        </w:rPr>
+        <w:t xml:space="preserve">We met this failure while building an agent with Gemma 4 31B, thinking off, for Kaggle's Gemma 4 Developer Agent competition. </w:t>
+      </w:r>
+      <w:r>
+        <w:rPr>
+          <w:rFonts w:hint="eastAsia"/>
+          <w:color w:val="EE0000"/>
+        </w:rPr>
+        <w:t>Our first plan was on-policy self-distillation from the same model with thinking on.</w:t>
+      </w:r>
+      <w:r>
+        <w:rPr>
+          <w:rFonts w:hint="eastAsia"/>
+        </w:rPr>
+        <w:t xml:space="preserve"> </w:t>
+      </w:r>
+      <w:r>
+        <w:rPr>
+          <w:rFonts w:hint="eastAsia"/>
+          <w:color w:val="EE0000"/>
+        </w:rPr>
+        <w:t>A check before training showed that the teacher shares the loop: given the agent's history at its third or later identical call, the thinking-on model repeated an earlier call 83% of the time. We turned to the loops themselves.</w:t>
+      </w:r>
+    </w:p>
+    <w:p>
+      <w:pPr>
+        <w:rPr>
+          <w:rFonts w:hint="eastAsia"/>
+        </w:rPr>
+      </w:pPr>
       <w:r>
         <w:rPr>
           <w:rFonts w:hint="eastAsia"/>
@@ -107,20 +177,40 @@
       </w:r>
     </w:p>
     <w:p>
-      <w:r>
-        <w:rPr>
-          <w:rFonts w:hint="eastAsia"/>
-        </w:rPr>
-        <w:t>We answer with one-step replays at recorded histories and with whole-task runs of three levers against a control at T = 0.2: sampling at T = 1, an empty thought before every call, and a proxy that collapses each run of identical calls to its first, holding the request fixed. Our contributions are:</w:t>
+      <w:pPr>
+        <w:rPr>
+          <w:rFonts w:hint="eastAsia"/>
+          <w:color w:val="EE0000"/>
+        </w:rPr>
+      </w:pPr>
+      <w:r>
+        <w:rPr>
+          <w:rFonts w:hint="eastAsia"/>
+          <w:color w:val="EE0000"/>
+        </w:rPr>
+        <w:t xml:space="preserve">We answer with one-step replays at recorded histories and with whole-task runs of </w:t>
+      </w:r>
+      <w:r>
+        <w:rPr>
+          <w:rFonts w:hint="eastAsia"/>
+          <w:color w:val="EE0000"/>
+        </w:rPr>
+        <w:lastRenderedPageBreak/>
+        <w:t>three levers against a control at T = 0.2: sampling at T = 1, an empty thought before every call, and a proxy that collapses each run of identical calls to its first, holding the request fixed. Our contributions are:</w:t>
       </w:r>
     </w:p>
     <w:p>
       <w:pPr>
         <w:ind w:left="360" w:hanging="240"/>
-      </w:pPr>
-      <w:r>
-        <w:rPr>
-          <w:rFonts w:hint="eastAsia"/>
+        <w:rPr>
+          <w:rFonts w:hint="eastAsia"/>
+          <w:color w:val="EE0000"/>
+        </w:rPr>
+      </w:pPr>
+      <w:r>
+        <w:rPr>
+          <w:rFonts w:hint="eastAsia"/>
+          <w:color w:val="EE0000"/>
         </w:rPr>
         <w:t>(1) Selection, then reinforcement. With the request held fixed, the chance of one more identical call still rises from 78% to 99%; identical copies add to it. Gemma 4 12B is 2.4 times as likely to copy a fresh call but holds a run as firmly (§4).</w:t>
       </w:r>
@@ -128,10 +218,15 @@
     <w:p>
       <w:pPr>
         <w:ind w:left="360" w:hanging="240"/>
-      </w:pPr>
-      <w:r>
-        <w:rPr>
-          <w:rFonts w:hint="eastAsia"/>
+        <w:rPr>
+          <w:rFonts w:hint="eastAsia"/>
+          <w:color w:val="EE0000"/>
+        </w:rPr>
+      </w:pPr>
+      <w:r>
+        <w:rPr>
+          <w:rFonts w:hint="eastAsia"/>
+          <w:color w:val="EE0000"/>
         </w:rPr>
         <w:t>(2) Loops end from outside. At T = 0.2 the agent never ended a run of five or more identical calls itself, in 1,342 chances (§5).</w:t>
       </w:r>
@@ -139,10 +234,15 @@
     <w:p>
       <w:pPr>
         <w:ind w:left="360" w:hanging="240"/>
-      </w:pPr>
-      <w:r>
-        <w:rPr>
-          <w:rFonts w:hint="eastAsia"/>
+        <w:rPr>
+          <w:rFonts w:hint="eastAsia"/>
+          <w:color w:val="EE0000"/>
+        </w:rPr>
+      </w:pPr>
+      <w:r>
+        <w:rPr>
+          <w:rFonts w:hint="eastAsia"/>
+          <w:color w:val="EE0000"/>
         </w:rPr>
         <w:t>(3) What cues the copy: the pattern of the context, not what the results say. Where the model chose not to think, a forced thought lets the next call escape 58% of the time, against 11% (§6).</w:t>
       </w:r>
@@ -150,10 +250,15 @@
     <w:p>
       <w:pPr>
         <w:ind w:left="360" w:hanging="240"/>
-      </w:pPr>
-      <w:r>
-        <w:rPr>
-          <w:rFonts w:hint="eastAsia"/>
+        <w:rPr>
+          <w:rFonts w:hint="eastAsia"/>
+          <w:color w:val="EE0000"/>
+        </w:rPr>
+      </w:pPr>
+      <w:r>
+        <w:rPr>
+          <w:rFonts w:hint="eastAsia"/>
+          <w:color w:val="EE0000"/>
         </w:rPr>
         <w:t>(4) Breaking loops does not pay. Every lever changes the loops, and none measurably changes resolution (§7).</w:t>
       </w:r>
@@ -161,6 +266,9 @@
     <w:p>
       <w:pPr>
         <w:spacing w:before="240"/>
+        <w:rPr>
+          <w:rFonts w:hint="eastAsia"/>
+        </w:rPr>
       </w:pPr>
       <w:r>
         <w:rPr>
@@ -173,6 +281,9 @@
     <w:p>
       <w:pPr>
         <w:ind w:left="360" w:hanging="240"/>
+        <w:rPr>
+          <w:rFonts w:hint="eastAsia"/>
+        </w:rPr>
       </w:pPr>
       <w:r>
         <w:rPr>
@@ -184,6 +295,9 @@
     <w:p>
       <w:pPr>
         <w:ind w:left="360" w:hanging="240"/>
+        <w:rPr>
+          <w:rFonts w:hint="eastAsia"/>
+        </w:rPr>
       </w:pPr>
       <w:r>
         <w:rPr>
@@ -195,6 +309,9 @@
     <w:p>
       <w:pPr>
         <w:ind w:left="360" w:hanging="240"/>
+        <w:rPr>
+          <w:rFonts w:hint="eastAsia"/>
+        </w:rPr>
       </w:pPr>
       <w:r>
         <w:rPr>
@@ -206,6 +323,9 @@
     <w:p>
       <w:pPr>
         <w:ind w:left="360" w:hanging="240"/>
+        <w:rPr>
+          <w:rFonts w:hint="eastAsia"/>
+        </w:rPr>
       </w:pPr>
       <w:r>
         <w:rPr>
@@ -217,6 +337,9 @@
     <w:p>
       <w:pPr>
         <w:ind w:left="360" w:hanging="240"/>
+        <w:rPr>
+          <w:rFonts w:hint="eastAsia"/>
+        </w:rPr>
       </w:pPr>
       <w:r>
         <w:rPr>
@@ -842,6 +965,7 @@
   <w:style w:type="character" w:default="1" w:styleId="a0">
     <w:name w:val="Default Paragraph Font"/>
     <w:uiPriority w:val="1"/>
+    <w:semiHidden/>
     <w:unhideWhenUsed/>
   </w:style>
   <w:style w:type="table" w:default="1" w:styleId="a1">

</xml_diff>